<commit_message>
Edge branding + scroll-toggle UI improvements
Switch extension docs and messaging from Chrome to Microsoft Edge (README updates). Update popup UI and behavior: replace review-settings glyph with an inline SVG, add a floating scroll-toggle button (SVG), styles for the new button and adjusted review-settings styling (popup.css/popup.html). Add scroll-toggle logic and metrics helpers in popup.js (event wiring, ResizeObserver, smooth scroll to top/bottom). Update built artifacts (dist/popup.bundle.js, dist/popup.html) to reflect these UI and Edge-related changes. Improves UX and aligns docs with Edge MV3.
</commit_message>
<xml_diff>
--- a/README.docx
+++ b/README.docx
@@ -28,7 +28,7 @@
         <w:jc w:val="left"/>
       </w:pPr>
       <w:r>
-        <w:t xml:space="preserve">Risk Profiler Review and Validate Automation is a Chrome Manifest V3 extension for Risk Profiler assessment review, validation, reporting, and documentation. It helps users load Risk Profiler application assessments from Cairo, filter and select assessments, validate selected assessments against a defined checkpoint list, review assessment migration/readiness items, export validation results to Excel, and download formatted Word review notes with selected questions, ASA Notes, contact details, and clickable checkbox controls.</w:t>
+        <w:t xml:space="preserve">Risk Profiler Review and Validate Automation is a Microsoft Edge Manifest V3 extension for Risk Profiler assessment review, validation, reporting, and documentation. It helps users load Risk Profiler application assessments from Cairo, filter and select assessments, validate selected assessments against a defined checkpoint list, review assessment migration/readiness items, export validation results to Excel, and download formatted Word review notes with selected questions, ASA Notes, contact details, and clickable checkbox controls.</w:t>
       </w:r>
     </w:p>
     <w:p>
@@ -45,7 +45,7 @@
         <w:jc w:val="left"/>
       </w:pPr>
       <w:r>
-        <w:t xml:space="preserve">The extension is designed for business users who need consistent review output and for technical teams who need traceable, repeatable, browser-based automation across Cairo, ESATS, and GTC data sources.</w:t>
+        <w:t xml:space="preserve">The extension is designed for business users who need consistent review output and for technical teams who need traceable, repeatable, Edge-based automation across Cairo, ESATS, and GTC data sources.</w:t>
       </w:r>
     </w:p>
     <w:p>
@@ -255,9 +255,9 @@
         </w:tblCellMar>
       </w:tblPr>
       <w:tblGrid>
-        <w:gridCol w:w="1787"/>
-        <w:gridCol w:w="3319"/>
-        <w:gridCol w:w="4254"/>
+        <w:gridCol w:w="1717"/>
+        <w:gridCol w:w="3349"/>
+        <w:gridCol w:w="4294"/>
       </w:tblGrid>
       <w:tr>
         <w:trPr>
@@ -313,27 +313,27 @@
               <w:jc w:val="left"/>
             </w:pPr>
             <w:r>
-              <w:t xml:space="preserve">Browser extension platform</w:t>
-            </w:r>
-          </w:p>
-        </w:tc>
-        <w:tc>
-          <w:p>
-            <w:pPr>
-              <w:jc w:val="left"/>
-            </w:pPr>
-            <w:r>
-              <w:t xml:space="preserve">Chrome Extension Manifest V3</w:t>
-            </w:r>
-          </w:p>
-        </w:tc>
-        <w:tc>
-          <w:p>
-            <w:pPr>
-              <w:jc w:val="left"/>
-            </w:pPr>
-            <w:r>
-              <w:t xml:space="preserve">Runs the popup UI and service worker automation inside Chrome.</w:t>
+              <w:t xml:space="preserve">Edge extension platform</w:t>
+            </w:r>
+          </w:p>
+        </w:tc>
+        <w:tc>
+          <w:p>
+            <w:pPr>
+              <w:jc w:val="left"/>
+            </w:pPr>
+            <w:r>
+              <w:t xml:space="preserve">Microsoft Edge Manifest V3</w:t>
+            </w:r>
+          </w:p>
+        </w:tc>
+        <w:tc>
+          <w:p>
+            <w:pPr>
+              <w:jc w:val="left"/>
+            </w:pPr>
+            <w:r>
+              <w:t xml:space="preserve">Runs the popup UI and service worker automation inside Microsoft Edge.</w:t>
             </w:r>
           </w:p>
         </w:tc>
@@ -481,31 +481,63 @@
               <w:jc w:val="left"/>
             </w:pPr>
             <w:r>
+              <w:t xml:space="preserve">Edge extension local storage with </w:t>
+            </w:r>
+            <w:r>
               <w:rPr>
                 <w:rFonts w:ascii="Courier New" w:cs="Courier New" w:eastAsia="Courier New" w:hAnsi="Courier New"/>
                 <w:shd w:fill="F1F5F9" w:color="auto" w:val="clear"/>
               </w:rPr>
-              <w:t xml:space="preserve">chrome.storage.local</w:t>
-            </w:r>
-            <w:r>
-              <w:t xml:space="preserve"> with </w:t>
-            </w:r>
+              <w:t xml:space="preserve">unlimitedStorage</w:t>
+            </w:r>
+          </w:p>
+        </w:tc>
+        <w:tc>
+          <w:p>
+            <w:pPr>
+              <w:jc w:val="left"/>
+            </w:pPr>
+            <w:r>
+              <w:t xml:space="preserve">Stores assessments, validation results, review results, selected review mode, progress, contexts, ASA Notes, and UI state.</w:t>
+            </w:r>
+          </w:p>
+        </w:tc>
+      </w:tr>
+      <w:tr>
+        <w:tc>
+          <w:p>
+            <w:pPr>
+              <w:jc w:val="left"/>
+            </w:pPr>
+            <w:r>
+              <w:t xml:space="preserve">API access</w:t>
+            </w:r>
+          </w:p>
+        </w:tc>
+        <w:tc>
+          <w:p>
+            <w:pPr>
+              <w:jc w:val="left"/>
+            </w:pPr>
             <w:r>
               <w:rPr>
                 <w:rFonts w:ascii="Courier New" w:cs="Courier New" w:eastAsia="Courier New" w:hAnsi="Courier New"/>
                 <w:shd w:fill="F1F5F9" w:color="auto" w:val="clear"/>
               </w:rPr>
-              <w:t xml:space="preserve">unlimitedStorage</w:t>
-            </w:r>
-          </w:p>
-        </w:tc>
-        <w:tc>
-          <w:p>
-            <w:pPr>
-              <w:jc w:val="left"/>
-            </w:pPr>
-            <w:r>
-              <w:t xml:space="preserve">Stores assessments, validation results, review results, selected review mode, progress, contexts, ASA Notes, and UI state.</w:t>
+              <w:t xml:space="preserve">fetch()</w:t>
+            </w:r>
+            <w:r>
+              <w:t xml:space="preserve"> with Edge session cookies and trusted-tab script execution</w:t>
+            </w:r>
+          </w:p>
+        </w:tc>
+        <w:tc>
+          <w:p>
+            <w:pPr>
+              <w:jc w:val="left"/>
+            </w:pPr>
+            <w:r>
+              <w:t xml:space="preserve">Calls Cairo directly and calls ESATS/GTC through signed-in trusted Edge tabs where needed.</w:t>
             </w:r>
           </w:p>
         </w:tc>
@@ -517,34 +549,44 @@
               <w:jc w:val="left"/>
             </w:pPr>
             <w:r>
-              <w:t xml:space="preserve">API access</w:t>
-            </w:r>
-          </w:p>
-        </w:tc>
-        <w:tc>
-          <w:p>
-            <w:pPr>
-              <w:jc w:val="left"/>
-            </w:pPr>
+              <w:t xml:space="preserve">Validation engine</w:t>
+            </w:r>
+          </w:p>
+        </w:tc>
+        <w:tc>
+          <w:p>
+            <w:pPr>
+              <w:jc w:val="left"/>
+            </w:pPr>
+            <w:r>
+              <w:t xml:space="preserve">Local JavaScript checkpoint modules </w:t>
+            </w:r>
             <w:r>
               <w:rPr>
                 <w:rFonts w:ascii="Courier New" w:cs="Courier New" w:eastAsia="Courier New" w:hAnsi="Courier New"/>
                 <w:shd w:fill="F1F5F9" w:color="auto" w:val="clear"/>
               </w:rPr>
-              <w:t xml:space="preserve">fetch()</w:t>
-            </w:r>
-            <w:r>
-              <w:t xml:space="preserve"> with browser cookies and trusted-tab script execution</w:t>
-            </w:r>
-          </w:p>
-        </w:tc>
-        <w:tc>
-          <w:p>
-            <w:pPr>
-              <w:jc w:val="left"/>
-            </w:pPr>
-            <w:r>
-              <w:t xml:space="preserve">Calls Cairo directly and calls ESATS/GTC through signed-in trusted tabs where needed.</w:t>
+              <w:t xml:space="preserve">RP1</w:t>
+            </w:r>
+            <w:r>
+              <w:t xml:space="preserve"> through </w:t>
+            </w:r>
+            <w:r>
+              <w:rPr>
+                <w:rFonts w:ascii="Courier New" w:cs="Courier New" w:eastAsia="Courier New" w:hAnsi="Courier New"/>
+                <w:shd w:fill="F1F5F9" w:color="auto" w:val="clear"/>
+              </w:rPr>
+              <w:t xml:space="preserve">RP13</w:t>
+            </w:r>
+          </w:p>
+        </w:tc>
+        <w:tc>
+          <w:p>
+            <w:pPr>
+              <w:jc w:val="left"/>
+            </w:pPr>
+            <w:r>
+              <w:t xml:space="preserve">Runs deterministic validation rules against assembled context, normalized answers, review approvals, and conditional question-summary data.</w:t>
             </w:r>
           </w:p>
         </w:tc>
@@ -556,44 +598,111 @@
               <w:jc w:val="left"/>
             </w:pPr>
             <w:r>
-              <w:t xml:space="preserve">Validation engine</w:t>
-            </w:r>
-          </w:p>
-        </w:tc>
-        <w:tc>
-          <w:p>
-            <w:pPr>
-              <w:jc w:val="left"/>
-            </w:pPr>
-            <w:r>
-              <w:t xml:space="preserve">Local JavaScript checkpoint modules </w:t>
+              <w:t xml:space="preserve">Review engine</w:t>
+            </w:r>
+          </w:p>
+        </w:tc>
+        <w:tc>
+          <w:p>
+            <w:pPr>
+              <w:jc w:val="left"/>
+            </w:pPr>
+            <w:r>
+              <w:t xml:space="preserve">Local JavaScript conversion of the provided Python reachable-unanswered-work-queue algorithm</w:t>
+            </w:r>
+          </w:p>
+        </w:tc>
+        <w:tc>
+          <w:p>
+            <w:pPr>
+              <w:jc w:val="left"/>
+            </w:pPr>
+            <w:r>
+              <w:t xml:space="preserve">Compares old/new questions and answers, applies review mode configuration, computes reachable unanswered review items, and records UI reachability reasons.</w:t>
+            </w:r>
+          </w:p>
+        </w:tc>
+      </w:tr>
+      <w:tr>
+        <w:tc>
+          <w:p>
+            <w:pPr>
+              <w:jc w:val="left"/>
+            </w:pPr>
+            <w:r>
+              <w:t xml:space="preserve">Excel export</w:t>
+            </w:r>
+          </w:p>
+        </w:tc>
+        <w:tc>
+          <w:p>
+            <w:pPr>
+              <w:jc w:val="left"/>
+            </w:pPr>
+            <w:r>
+              <w:t xml:space="preserve">Bundled </w:t>
             </w:r>
             <w:r>
               <w:rPr>
                 <w:rFonts w:ascii="Courier New" w:cs="Courier New" w:eastAsia="Courier New" w:hAnsi="Courier New"/>
                 <w:shd w:fill="F1F5F9" w:color="auto" w:val="clear"/>
               </w:rPr>
-              <w:t xml:space="preserve">RP1</w:t>
-            </w:r>
-            <w:r>
-              <w:t xml:space="preserve"> through </w:t>
+              <w:t xml:space="preserve">ExcelJS</w:t>
+            </w:r>
+            <w:r>
+              <w:t xml:space="preserve"> plus encoded workbook template</w:t>
+            </w:r>
+          </w:p>
+        </w:tc>
+        <w:tc>
+          <w:p>
+            <w:pPr>
+              <w:jc w:val="left"/>
+            </w:pPr>
+            <w:r>
+              <w:t xml:space="preserve">Creates validation workbook with summary and assessment-level sheets.</w:t>
+            </w:r>
+          </w:p>
+        </w:tc>
+      </w:tr>
+      <w:tr>
+        <w:tc>
+          <w:p>
+            <w:pPr>
+              <w:jc w:val="left"/>
+            </w:pPr>
+            <w:r>
+              <w:t xml:space="preserve">Word export</w:t>
+            </w:r>
+          </w:p>
+        </w:tc>
+        <w:tc>
+          <w:p>
+            <w:pPr>
+              <w:jc w:val="left"/>
+            </w:pPr>
+            <w:r>
+              <w:t xml:space="preserve">Custom OpenXML </w:t>
             </w:r>
             <w:r>
               <w:rPr>
                 <w:rFonts w:ascii="Courier New" w:cs="Courier New" w:eastAsia="Courier New" w:hAnsi="Courier New"/>
                 <w:shd w:fill="F1F5F9" w:color="auto" w:val="clear"/>
               </w:rPr>
-              <w:t xml:space="preserve">RP13</w:t>
-            </w:r>
-          </w:p>
-        </w:tc>
-        <w:tc>
-          <w:p>
-            <w:pPr>
-              <w:jc w:val="left"/>
-            </w:pPr>
-            <w:r>
-              <w:t xml:space="preserve">Runs deterministic validation rules against assembled context, normalized answers, review approvals, and conditional question-summary data.</w:t>
+              <w:t xml:space="preserve">.docx</w:t>
+            </w:r>
+            <w:r>
+              <w:t xml:space="preserve"> generator</w:t>
+            </w:r>
+          </w:p>
+        </w:tc>
+        <w:tc>
+          <w:p>
+            <w:pPr>
+              <w:jc w:val="left"/>
+            </w:pPr>
+            <w:r>
+              <w:t xml:space="preserve">Creates Word review notes with formatted tables, sections, and clickable checkbox content controls.</w:t>
             </w:r>
           </w:p>
         </w:tc>
@@ -605,136 +714,20 @@
               <w:jc w:val="left"/>
             </w:pPr>
             <w:r>
-              <w:t xml:space="preserve">Review engine</w:t>
-            </w:r>
-          </w:p>
-        </w:tc>
-        <w:tc>
-          <w:p>
-            <w:pPr>
-              <w:jc w:val="left"/>
-            </w:pPr>
-            <w:r>
-              <w:t xml:space="preserve">Local JavaScript conversion of the provided Python reachable-unanswered-work-queue algorithm</w:t>
-            </w:r>
-          </w:p>
-        </w:tc>
-        <w:tc>
-          <w:p>
-            <w:pPr>
-              <w:jc w:val="left"/>
-            </w:pPr>
-            <w:r>
-              <w:t xml:space="preserve">Compares old/new questions and answers, applies review mode configuration, computes reachable unanswered review items, and records UI reachability reasons.</w:t>
-            </w:r>
-          </w:p>
-        </w:tc>
-      </w:tr>
-      <w:tr>
-        <w:tc>
-          <w:p>
-            <w:pPr>
-              <w:jc w:val="left"/>
-            </w:pPr>
-            <w:r>
-              <w:t xml:space="preserve">Excel export</w:t>
-            </w:r>
-          </w:p>
-        </w:tc>
-        <w:tc>
-          <w:p>
-            <w:pPr>
-              <w:jc w:val="left"/>
-            </w:pPr>
-            <w:r>
-              <w:t xml:space="preserve">Bundled </w:t>
-            </w:r>
+              <w:t xml:space="preserve">Build output</w:t>
+            </w:r>
+          </w:p>
+        </w:tc>
+        <w:tc>
+          <w:p>
+            <w:pPr>
+              <w:jc w:val="left"/>
+            </w:pPr>
             <w:r>
               <w:rPr>
                 <w:rFonts w:ascii="Courier New" w:cs="Courier New" w:eastAsia="Courier New" w:hAnsi="Courier New"/>
                 <w:shd w:fill="F1F5F9" w:color="auto" w:val="clear"/>
               </w:rPr>
-              <w:t xml:space="preserve">ExcelJS</w:t>
-            </w:r>
-            <w:r>
-              <w:t xml:space="preserve"> plus encoded workbook template</w:t>
-            </w:r>
-          </w:p>
-        </w:tc>
-        <w:tc>
-          <w:p>
-            <w:pPr>
-              <w:jc w:val="left"/>
-            </w:pPr>
-            <w:r>
-              <w:t xml:space="preserve">Creates validation workbook with summary and assessment-level sheets.</w:t>
-            </w:r>
-          </w:p>
-        </w:tc>
-      </w:tr>
-      <w:tr>
-        <w:tc>
-          <w:p>
-            <w:pPr>
-              <w:jc w:val="left"/>
-            </w:pPr>
-            <w:r>
-              <w:t xml:space="preserve">Word export</w:t>
-            </w:r>
-          </w:p>
-        </w:tc>
-        <w:tc>
-          <w:p>
-            <w:pPr>
-              <w:jc w:val="left"/>
-            </w:pPr>
-            <w:r>
-              <w:t xml:space="preserve">Custom OpenXML </w:t>
-            </w:r>
-            <w:r>
-              <w:rPr>
-                <w:rFonts w:ascii="Courier New" w:cs="Courier New" w:eastAsia="Courier New" w:hAnsi="Courier New"/>
-                <w:shd w:fill="F1F5F9" w:color="auto" w:val="clear"/>
-              </w:rPr>
-              <w:t xml:space="preserve">.docx</w:t>
-            </w:r>
-            <w:r>
-              <w:t xml:space="preserve"> generator</w:t>
-            </w:r>
-          </w:p>
-        </w:tc>
-        <w:tc>
-          <w:p>
-            <w:pPr>
-              <w:jc w:val="left"/>
-            </w:pPr>
-            <w:r>
-              <w:t xml:space="preserve">Creates Word review notes with formatted tables, sections, and clickable checkbox content controls.</w:t>
-            </w:r>
-          </w:p>
-        </w:tc>
-      </w:tr>
-      <w:tr>
-        <w:tc>
-          <w:p>
-            <w:pPr>
-              <w:jc w:val="left"/>
-            </w:pPr>
-            <w:r>
-              <w:t xml:space="preserve">Build output</w:t>
-            </w:r>
-          </w:p>
-        </w:tc>
-        <w:tc>
-          <w:p>
-            <w:pPr>
-              <w:jc w:val="left"/>
-            </w:pPr>
-            <w:r>
-              <w:rPr>
-                <w:rFonts w:ascii="Courier New" w:cs="Courier New" w:eastAsia="Courier New" w:hAnsi="Courier New"/>
-                <w:shd w:fill="F1F5F9" w:color="auto" w:val="clear"/>
-              </w:rPr>
               <w:t xml:space="preserve">dist/</w:t>
             </w:r>
             <w:r>
@@ -886,7 +879,7 @@
         <w:t xml:space="preserve">storage/</w:t>
       </w:r>
       <w:r>
-        <w:t xml:space="preserve">: Chrome local storage helpers.</w:t>
+        <w:t xml:space="preserve">: Edge extension local storage helpers.</w:t>
       </w:r>
     </w:p>
     <w:p>
@@ -1135,7 +1128,7 @@
               <w:jc w:val="left"/>
             </w:pPr>
             <w:r>
-              <w:t xml:space="preserve">Prevents Chrome storage quota pressure when many assessments, contexts, and result sets are retained locally.</w:t>
+              <w:t xml:space="preserve">Prevents Edge extension storage quota pressure when many assessments, contexts, and result sets are retained locally.</w:t>
             </w:r>
           </w:p>
         </w:tc>
@@ -1554,7 +1547,7 @@
         <w:t xml:space="preserve">7. </w:t>
       </w:r>
       <w:r>
-        <w:t xml:space="preserve">Persists validation and review results separately in local browser storage.</w:t>
+        <w:t xml:space="preserve">Persists validation and review results separately in local Edge extension storage.</w:t>
       </w:r>
     </w:p>
     <w:p>
@@ -2483,17 +2476,7 @@
         <w:jc w:val="left"/>
       </w:pPr>
       <w:r>
-        <w:t xml:space="preserve">ESATS gateway requests are executed from a trusted signed-in ESATS tab using </w:t>
-      </w:r>
-      <w:r>
-        <w:rPr>
-          <w:rFonts w:ascii="Courier New" w:cs="Courier New" w:eastAsia="Courier New" w:hAnsi="Courier New"/>
-          <w:shd w:fill="F1F5F9" w:color="auto" w:val="clear"/>
-        </w:rPr>
-        <w:t xml:space="preserve">chrome.scripting.executeScript</w:t>
-      </w:r>
-      <w:r>
-        <w:t xml:space="preserve">. The extension reads the ESATS token from the ESATS page context and sends it as a bearer token when available.</w:t>
+        <w:t xml:space="preserve">ESATS gateway requests are executed from a trusted signed-in ESATS tab using the Edge extension scripting API. The extension reads the ESATS token from the ESATS page context and sends it as a bearer token when available.</w:t>
       </w:r>
     </w:p>
     <w:p>
@@ -2938,7 +2921,7 @@
         <w:jc w:val="left"/>
       </w:pPr>
       <w:r>
-        <w:t xml:space="preserve">The extension uses browser-side concurrency:</w:t>
+        <w:t xml:space="preserve">The extension uses Edge-side concurrency:</w:t>
       </w:r>
     </w:p>
     <w:p>
@@ -5340,17 +5323,7 @@
         <w:t xml:space="preserve">3. </w:t>
       </w:r>
       <w:r>
-        <w:t xml:space="preserve">Records are stored in </w:t>
-      </w:r>
-      <w:r>
-        <w:rPr>
-          <w:rFonts w:ascii="Courier New" w:cs="Courier New" w:eastAsia="Courier New" w:hAnsi="Courier New"/>
-          <w:shd w:fill="F1F5F9" w:color="auto" w:val="clear"/>
-        </w:rPr>
-        <w:t xml:space="preserve">chrome.storage.local</w:t>
-      </w:r>
-      <w:r>
-        <w:t xml:space="preserve">.</w:t>
+        <w:t xml:space="preserve">Records are stored in Edge extension local storage.</w:t>
       </w:r>
     </w:p>
     <w:p>
@@ -5363,7 +5336,7 @@
         <w:t xml:space="preserve">4. </w:t>
       </w:r>
       <w:r>
-        <w:t xml:space="preserve">The refresh also runs automatically on extension install, browser startup, and every 30 minutes by Chrome alarm.</w:t>
+        <w:t xml:space="preserve">The refresh also runs automatically on extension install, Edge startup, and every 30 minutes by extension alarm.</w:t>
       </w:r>
     </w:p>
     <w:p>
@@ -6486,7 +6459,7 @@
         <w:t xml:space="preserve">.docx</w:t>
       </w:r>
       <w:r>
-        <w:t xml:space="preserve"> files directly in the browser using OpenXML:</w:t>
+        <w:t xml:space="preserve"> files directly in Edge using OpenXML:</w:t>
       </w:r>
     </w:p>
     <w:p>
@@ -6627,7 +6600,7 @@
         <w:jc w:val="left"/>
       </w:pPr>
       <w:r>
-        <w:t xml:space="preserve">Downloads the file through a browser Blob</w:t>
+        <w:t xml:space="preserve">Downloads the file through an Edge Blob download</w:t>
       </w:r>
     </w:p>
     <w:p>
@@ -6798,7 +6771,7 @@
         <w:t xml:space="preserve">1. </w:t>
       </w:r>
       <w:r>
-        <w:t xml:space="preserve">Open Chrome and sign in to Cairo, ESATS, and GTC.</w:t>
+        <w:t xml:space="preserve">Open Microsoft Edge and sign in to Cairo, ESATS, and GTC.</w:t>
       </w:r>
     </w:p>
     <w:p>
@@ -7379,22 +7352,22 @@
         <w:jc w:val="left"/>
       </w:pPr>
       <w:r>
-        <w:t xml:space="preserve">It stores results locally in Chrome.</w:t>
-      </w:r>
-    </w:p>
-    <w:p>
-      <w:pPr>
-        <w:pStyle w:val="ListParagraph"/>
-        <w:numPr>
-          <w:ilvl w:val="0"/>
-          <w:numId w:val="2"/>
-        </w:numPr>
-        <w:spacing w:after="100"/>
-        <w:ind w:start="240"/>
-        <w:jc w:val="left"/>
-      </w:pPr>
-      <w:r>
-        <w:t xml:space="preserve">It stores selected review mode and ASA Notes locally in Chrome.</w:t>
+        <w:t xml:space="preserve">It stores results locally in Microsoft Edge extension storage.</w:t>
+      </w:r>
+    </w:p>
+    <w:p>
+      <w:pPr>
+        <w:pStyle w:val="ListParagraph"/>
+        <w:numPr>
+          <w:ilvl w:val="0"/>
+          <w:numId w:val="2"/>
+        </w:numPr>
+        <w:spacing w:after="100"/>
+        <w:ind w:start="240"/>
+        <w:jc w:val="left"/>
+      </w:pPr>
+      <w:r>
+        <w:t xml:space="preserve">It stores selected review mode and ASA Notes locally in Microsoft Edge extension storage.</w:t>
       </w:r>
     </w:p>
     <w:p>
@@ -7476,7 +7449,7 @@
         <w:jc w:val="left"/>
       </w:pPr>
       <w:r>
-        <w:t xml:space="preserve">The application follows a modular browser-extension architecture:</w:t>
+        <w:t xml:space="preserve">The application follows a modular Microsoft Edge extension architecture:</w:t>
       </w:r>
     </w:p>
     <w:p>
@@ -7559,7 +7532,7 @@
         <w:jc w:val="left"/>
       </w:pPr>
       <w:r>
-        <w:t xml:space="preserve">Storage helpers isolate Chrome local storage.</w:t>
+        <w:t xml:space="preserve">Storage helpers isolate Edge extension local storage.</w:t>
       </w:r>
     </w:p>
     <w:p>
@@ -7655,7 +7628,7 @@
           <w:sz w:val="20"/>
           <w:szCs w:val="20"/>
         </w:rPr>
-        <w:t xml:space="preserve">      -&gt; chrome.runtime message    </w:t>
+        <w:t xml:space="preserve">      -&gt; Edge runtime message    </w:t>
       </w:r>
       <w:r>
         <w:br/>
@@ -7703,7 +7676,7 @@
           <w:sz w:val="20"/>
           <w:szCs w:val="20"/>
         </w:rPr>
-        <w:t xml:space="preserve">      -&gt; chrome.storage.local    </w:t>
+        <w:t xml:space="preserve">      -&gt; Edge extension local storage    </w:t>
       </w:r>
       <w:r>
         <w:br/>
@@ -8467,7 +8440,7 @@
         <w:jc w:val="left"/>
       </w:pPr>
       <w:r>
-        <w:t xml:space="preserve">The extension relies on existing authenticated browser sessions.</w:t>
+        <w:t xml:space="preserve">The extension relies on existing authenticated Microsoft Edge sessions.</w:t>
       </w:r>
     </w:p>
     <w:p>
@@ -8507,89 +8480,305 @@
         <w:jc w:val="left"/>
       </w:pPr>
       <w:r>
-        <w:t xml:space="preserve">ESATS and GTC calls may run inside trusted signed-in tabs through </w:t>
+        <w:t xml:space="preserve">ESATS and GTC calls may run inside trusted signed-in tabs through the Edge extension scripting API.</w:t>
+      </w:r>
+    </w:p>
+    <w:p>
+      <w:pPr>
+        <w:pStyle w:val="ListParagraph"/>
+        <w:numPr>
+          <w:ilvl w:val="0"/>
+          <w:numId w:val="2"/>
+        </w:numPr>
+        <w:spacing w:after="100"/>
+        <w:ind w:start="240"/>
+        <w:jc w:val="left"/>
+      </w:pPr>
+      <w:r>
+        <w:t xml:space="preserve">The extension does not ask users for passwords.</w:t>
+      </w:r>
+    </w:p>
+    <w:p>
+      <w:pPr>
+        <w:pStyle w:val="ListParagraph"/>
+        <w:numPr>
+          <w:ilvl w:val="0"/>
+          <w:numId w:val="2"/>
+        </w:numPr>
+        <w:spacing w:after="100"/>
+        <w:ind w:start="240"/>
+        <w:jc w:val="left"/>
+      </w:pPr>
+      <w:r>
+        <w:t xml:space="preserve">The extension does not write back to Cairo, ESATS, or GTC.</w:t>
+      </w:r>
+    </w:p>
+    <w:p>
+      <w:pPr>
+        <w:pStyle w:val="ListParagraph"/>
+        <w:numPr>
+          <w:ilvl w:val="0"/>
+          <w:numId w:val="2"/>
+        </w:numPr>
+        <w:spacing w:after="100"/>
+        <w:ind w:start="240"/>
+        <w:jc w:val="left"/>
+      </w:pPr>
+      <w:r>
+        <w:t xml:space="preserve">Output artifacts are generated locally in Microsoft Edge.</w:t>
+      </w:r>
+    </w:p>
+    <w:p>
+      <w:pPr>
+        <w:spacing w:after="200"/>
+      </w:pPr>
+      <w:r>
+        <w:t xml:space="preserve"> </w:t>
+      </w:r>
+    </w:p>
+    <w:p>
+      <w:pPr>
+        <w:pStyle w:val="Heading2"/>
+        <w:spacing w:after="200"/>
+        <w:jc w:val="left"/>
+      </w:pPr>
+      <w:r>
+        <w:t xml:space="preserve">4. Enterprise Production Readiness</w:t>
+      </w:r>
+    </w:p>
+    <w:p>
+      <w:pPr>
+        <w:spacing w:after="120"/>
+        <w:jc w:val="left"/>
+      </w:pPr>
+      <w:r>
+        <w:t xml:space="preserve">To scale this extension for enterprise-level production use, the following controls and enhancements are recommended.</w:t>
+      </w:r>
+    </w:p>
+    <w:p>
+      <w:pPr>
+        <w:spacing w:after="200"/>
+      </w:pPr>
+      <w:r>
+        <w:t xml:space="preserve"> </w:t>
+      </w:r>
+    </w:p>
+    <w:p>
+      <w:pPr>
+        <w:pStyle w:val="Heading3"/>
+        <w:spacing w:after="200"/>
+        <w:jc w:val="left"/>
+      </w:pPr>
+      <w:r>
+        <w:t xml:space="preserve">Deployment and Governance</w:t>
+      </w:r>
+    </w:p>
+    <w:p>
+      <w:pPr>
+        <w:pStyle w:val="ListParagraph"/>
+        <w:numPr>
+          <w:ilvl w:val="0"/>
+          <w:numId w:val="2"/>
+        </w:numPr>
+        <w:spacing w:after="100"/>
+        <w:ind w:start="240"/>
+        <w:jc w:val="left"/>
+      </w:pPr>
+      <w:r>
+        <w:t xml:space="preserve">Publish through Microsoft Edge Add-ons or managed enterprise Edge extension deployment.</w:t>
+      </w:r>
+    </w:p>
+    <w:p>
+      <w:pPr>
+        <w:pStyle w:val="ListParagraph"/>
+        <w:numPr>
+          <w:ilvl w:val="0"/>
+          <w:numId w:val="2"/>
+        </w:numPr>
+        <w:spacing w:after="100"/>
+        <w:ind w:start="240"/>
+        <w:jc w:val="left"/>
+      </w:pPr>
+      <w:r>
+        <w:t xml:space="preserve">Lock extension ID and versioning.</w:t>
+      </w:r>
+    </w:p>
+    <w:p>
+      <w:pPr>
+        <w:pStyle w:val="ListParagraph"/>
+        <w:numPr>
+          <w:ilvl w:val="0"/>
+          <w:numId w:val="2"/>
+        </w:numPr>
+        <w:spacing w:after="100"/>
+        <w:ind w:start="240"/>
+        <w:jc w:val="left"/>
+      </w:pPr>
+      <w:r>
+        <w:t xml:space="preserve">Use controlled release channels: development, pilot, production.</w:t>
+      </w:r>
+    </w:p>
+    <w:p>
+      <w:pPr>
+        <w:pStyle w:val="ListParagraph"/>
+        <w:numPr>
+          <w:ilvl w:val="0"/>
+          <w:numId w:val="2"/>
+        </w:numPr>
+        <w:spacing w:after="100"/>
+        <w:ind w:start="240"/>
+        <w:jc w:val="left"/>
+      </w:pPr>
+      <w:r>
+        <w:t xml:space="preserve">Require formal change approvals for endpoint, permission, and validation-rule changes.</w:t>
+      </w:r>
+    </w:p>
+    <w:p>
+      <w:pPr>
+        <w:pStyle w:val="ListParagraph"/>
+        <w:numPr>
+          <w:ilvl w:val="0"/>
+          <w:numId w:val="2"/>
+        </w:numPr>
+        <w:spacing w:after="100"/>
+        <w:ind w:start="240"/>
+        <w:jc w:val="left"/>
+      </w:pPr>
+      <w:r>
+        <w:t xml:space="preserve">Maintain a release note for each version.</w:t>
+      </w:r>
+    </w:p>
+    <w:p>
+      <w:pPr>
+        <w:spacing w:after="200"/>
+      </w:pPr>
+      <w:r>
+        <w:t xml:space="preserve"> </w:t>
+      </w:r>
+    </w:p>
+    <w:p>
+      <w:pPr>
+        <w:pStyle w:val="Heading3"/>
+        <w:spacing w:after="200"/>
+        <w:jc w:val="left"/>
+      </w:pPr>
+      <w:r>
+        <w:t xml:space="preserve">Security Hardening</w:t>
+      </w:r>
+    </w:p>
+    <w:p>
+      <w:pPr>
+        <w:pStyle w:val="ListParagraph"/>
+        <w:numPr>
+          <w:ilvl w:val="0"/>
+          <w:numId w:val="2"/>
+        </w:numPr>
+        <w:spacing w:after="100"/>
+        <w:ind w:start="240"/>
+        <w:jc w:val="left"/>
+      </w:pPr>
+      <w:r>
+        <w:t xml:space="preserve">Review and approve all host permissions.</w:t>
+      </w:r>
+    </w:p>
+    <w:p>
+      <w:pPr>
+        <w:pStyle w:val="ListParagraph"/>
+        <w:numPr>
+          <w:ilvl w:val="0"/>
+          <w:numId w:val="2"/>
+        </w:numPr>
+        <w:spacing w:after="100"/>
+        <w:ind w:start="240"/>
+        <w:jc w:val="left"/>
+      </w:pPr>
+      <w:r>
+        <w:t xml:space="preserve">Keep host permissions limited to required Boeing domains.</w:t>
+      </w:r>
+    </w:p>
+    <w:p>
+      <w:pPr>
+        <w:pStyle w:val="ListParagraph"/>
+        <w:numPr>
+          <w:ilvl w:val="0"/>
+          <w:numId w:val="2"/>
+        </w:numPr>
+        <w:spacing w:after="100"/>
+        <w:ind w:start="240"/>
+        <w:jc w:val="left"/>
+      </w:pPr>
+      <w:r>
+        <w:t xml:space="preserve">Add content security policy review during release.</w:t>
+      </w:r>
+    </w:p>
+    <w:p>
+      <w:pPr>
+        <w:pStyle w:val="ListParagraph"/>
+        <w:numPr>
+          <w:ilvl w:val="0"/>
+          <w:numId w:val="2"/>
+        </w:numPr>
+        <w:spacing w:after="100"/>
+        <w:ind w:start="240"/>
+        <w:jc w:val="left"/>
+      </w:pPr>
+      <w:r>
+        <w:t xml:space="preserve">Avoid broad </w:t>
       </w:r>
       <w:r>
         <w:rPr>
           <w:rFonts w:ascii="Courier New" w:cs="Courier New" w:eastAsia="Courier New" w:hAnsi="Courier New"/>
           <w:shd w:fill="F1F5F9" w:color="auto" w:val="clear"/>
         </w:rPr>
-        <w:t xml:space="preserve">chrome.scripting</w:t>
-      </w:r>
-      <w:r>
-        <w:t xml:space="preserve">.</w:t>
-      </w:r>
-    </w:p>
-    <w:p>
-      <w:pPr>
-        <w:pStyle w:val="ListParagraph"/>
-        <w:numPr>
-          <w:ilvl w:val="0"/>
-          <w:numId w:val="2"/>
-        </w:numPr>
-        <w:spacing w:after="100"/>
-        <w:ind w:start="240"/>
-        <w:jc w:val="left"/>
-      </w:pPr>
-      <w:r>
-        <w:t xml:space="preserve">The extension does not ask users for passwords.</w:t>
-      </w:r>
-    </w:p>
-    <w:p>
-      <w:pPr>
-        <w:pStyle w:val="ListParagraph"/>
-        <w:numPr>
-          <w:ilvl w:val="0"/>
-          <w:numId w:val="2"/>
-        </w:numPr>
-        <w:spacing w:after="100"/>
-        <w:ind w:start="240"/>
-        <w:jc w:val="left"/>
-      </w:pPr>
-      <w:r>
-        <w:t xml:space="preserve">The extension does not write back to Cairo, ESATS, or GTC.</w:t>
-      </w:r>
-    </w:p>
-    <w:p>
-      <w:pPr>
-        <w:pStyle w:val="ListParagraph"/>
-        <w:numPr>
-          <w:ilvl w:val="0"/>
-          <w:numId w:val="2"/>
-        </w:numPr>
-        <w:spacing w:after="100"/>
-        <w:ind w:start="240"/>
-        <w:jc w:val="left"/>
-      </w:pPr>
-      <w:r>
-        <w:t xml:space="preserve">Output artifacts are generated locally in the browser.</w:t>
-      </w:r>
-    </w:p>
-    <w:p>
-      <w:pPr>
-        <w:spacing w:after="200"/>
-      </w:pPr>
-      <w:r>
-        <w:t xml:space="preserve"> </w:t>
-      </w:r>
-    </w:p>
-    <w:p>
-      <w:pPr>
-        <w:pStyle w:val="Heading2"/>
-        <w:spacing w:after="200"/>
-        <w:jc w:val="left"/>
-      </w:pPr>
-      <w:r>
-        <w:t xml:space="preserve">4. Enterprise Production Readiness</w:t>
-      </w:r>
-    </w:p>
-    <w:p>
-      <w:pPr>
-        <w:spacing w:after="120"/>
-        <w:jc w:val="left"/>
-      </w:pPr>
-      <w:r>
-        <w:t xml:space="preserve">To scale this extension for enterprise-level production use, the following controls and enhancements are recommended.</w:t>
+        <w:t xml:space="preserve">&lt;all_urls&gt;</w:t>
+      </w:r>
+      <w:r>
+        <w:t xml:space="preserve"> web-accessible resources unless explicitly justified.</w:t>
+      </w:r>
+    </w:p>
+    <w:p>
+      <w:pPr>
+        <w:pStyle w:val="ListParagraph"/>
+        <w:numPr>
+          <w:ilvl w:val="0"/>
+          <w:numId w:val="2"/>
+        </w:numPr>
+        <w:spacing w:after="100"/>
+        <w:ind w:start="240"/>
+        <w:jc w:val="left"/>
+      </w:pPr>
+      <w:r>
+        <w:t xml:space="preserve">Consider moving any sensitive endpoint configuration into a centrally managed configuration file.</w:t>
+      </w:r>
+    </w:p>
+    <w:p>
+      <w:pPr>
+        <w:pStyle w:val="ListParagraph"/>
+        <w:numPr>
+          <w:ilvl w:val="0"/>
+          <w:numId w:val="2"/>
+        </w:numPr>
+        <w:spacing w:after="100"/>
+        <w:ind w:start="240"/>
+        <w:jc w:val="left"/>
+      </w:pPr>
+      <w:r>
+        <w:t xml:space="preserve">Perform a security review of Edge extension scripting usage because it executes code in trusted pages.</w:t>
+      </w:r>
+    </w:p>
+    <w:p>
+      <w:pPr>
+        <w:pStyle w:val="ListParagraph"/>
+        <w:numPr>
+          <w:ilvl w:val="0"/>
+          <w:numId w:val="2"/>
+        </w:numPr>
+        <w:spacing w:after="100"/>
+        <w:ind w:start="240"/>
+        <w:jc w:val="left"/>
+      </w:pPr>
+      <w:r>
+        <w:t xml:space="preserve">Add static analysis and dependency scanning to the build pipeline.</w:t>
       </w:r>
     </w:p>
     <w:p>
@@ -8607,82 +8796,172 @@
         <w:jc w:val="left"/>
       </w:pPr>
       <w:r>
-        <w:t xml:space="preserve">Deployment and Governance</w:t>
-      </w:r>
-    </w:p>
-    <w:p>
-      <w:pPr>
-        <w:pStyle w:val="ListParagraph"/>
-        <w:numPr>
-          <w:ilvl w:val="0"/>
-          <w:numId w:val="2"/>
-        </w:numPr>
-        <w:spacing w:after="100"/>
-        <w:ind w:start="240"/>
-        <w:jc w:val="left"/>
-      </w:pPr>
-      <w:r>
-        <w:t xml:space="preserve">Publish through an enterprise Chrome Web Store or managed extension deployment.</w:t>
-      </w:r>
-    </w:p>
-    <w:p>
-      <w:pPr>
-        <w:pStyle w:val="ListParagraph"/>
-        <w:numPr>
-          <w:ilvl w:val="0"/>
-          <w:numId w:val="2"/>
-        </w:numPr>
-        <w:spacing w:after="100"/>
-        <w:ind w:start="240"/>
-        <w:jc w:val="left"/>
-      </w:pPr>
-      <w:r>
-        <w:t xml:space="preserve">Lock extension ID and versioning.</w:t>
-      </w:r>
-    </w:p>
-    <w:p>
-      <w:pPr>
-        <w:pStyle w:val="ListParagraph"/>
-        <w:numPr>
-          <w:ilvl w:val="0"/>
-          <w:numId w:val="2"/>
-        </w:numPr>
-        <w:spacing w:after="100"/>
-        <w:ind w:start="240"/>
-        <w:jc w:val="left"/>
-      </w:pPr>
-      <w:r>
-        <w:t xml:space="preserve">Use controlled release channels: development, pilot, production.</w:t>
-      </w:r>
-    </w:p>
-    <w:p>
-      <w:pPr>
-        <w:pStyle w:val="ListParagraph"/>
-        <w:numPr>
-          <w:ilvl w:val="0"/>
-          <w:numId w:val="2"/>
-        </w:numPr>
-        <w:spacing w:after="100"/>
-        <w:ind w:start="240"/>
-        <w:jc w:val="left"/>
-      </w:pPr>
-      <w:r>
-        <w:t xml:space="preserve">Require formal change approvals for endpoint, permission, and validation-rule changes.</w:t>
-      </w:r>
-    </w:p>
-    <w:p>
-      <w:pPr>
-        <w:pStyle w:val="ListParagraph"/>
-        <w:numPr>
-          <w:ilvl w:val="0"/>
-          <w:numId w:val="2"/>
-        </w:numPr>
-        <w:spacing w:after="100"/>
-        <w:ind w:start="240"/>
-        <w:jc w:val="left"/>
-      </w:pPr>
-      <w:r>
-        <w:t xml:space="preserve">Maintain a release note for each version.</w:t>
+        <w:t xml:space="preserve">Performance and Scale</w:t>
+      </w:r>
+    </w:p>
+    <w:p>
+      <w:pPr>
+        <w:pStyle w:val="ListParagraph"/>
+        <w:numPr>
+          <w:ilvl w:val="0"/>
+          <w:numId w:val="2"/>
+        </w:numPr>
+        <w:spacing w:after="100"/>
+        <w:ind w:start="240"/>
+        <w:jc w:val="left"/>
+      </w:pPr>
+      <w:r>
+        <w:t xml:space="preserve">Keep validation concurrency configurable.</w:t>
+      </w:r>
+    </w:p>
+    <w:p>
+      <w:pPr>
+        <w:pStyle w:val="ListParagraph"/>
+        <w:numPr>
+          <w:ilvl w:val="0"/>
+          <w:numId w:val="2"/>
+        </w:numPr>
+        <w:spacing w:after="100"/>
+        <w:ind w:start="240"/>
+        <w:jc w:val="left"/>
+      </w:pPr>
+      <w:r>
+        <w:t xml:space="preserve">Keep review concurrency configurable.</w:t>
+      </w:r>
+    </w:p>
+    <w:p>
+      <w:pPr>
+        <w:pStyle w:val="ListParagraph"/>
+        <w:numPr>
+          <w:ilvl w:val="0"/>
+          <w:numId w:val="2"/>
+        </w:numPr>
+        <w:spacing w:after="100"/>
+        <w:ind w:start="240"/>
+        <w:jc w:val="left"/>
+      </w:pPr>
+      <w:r>
+        <w:t xml:space="preserve">Add API rate-limit backoff if upstream systems require it.</w:t>
+      </w:r>
+    </w:p>
+    <w:p>
+      <w:pPr>
+        <w:pStyle w:val="ListParagraph"/>
+        <w:numPr>
+          <w:ilvl w:val="0"/>
+          <w:numId w:val="2"/>
+        </w:numPr>
+        <w:spacing w:after="100"/>
+        <w:ind w:start="240"/>
+        <w:jc w:val="left"/>
+      </w:pPr>
+      <w:r>
+        <w:t xml:space="preserve">Add request telemetry counters for:</w:t>
+      </w:r>
+    </w:p>
+    <w:p>
+      <w:pPr>
+        <w:pStyle w:val="ListParagraph"/>
+        <w:numPr>
+          <w:ilvl w:val="1"/>
+          <w:numId w:val="2"/>
+        </w:numPr>
+        <w:spacing w:after="100"/>
+        <w:ind w:start="660"/>
+        <w:jc w:val="left"/>
+      </w:pPr>
+      <w:r>
+        <w:t xml:space="preserve">successful requests,</w:t>
+      </w:r>
+    </w:p>
+    <w:p>
+      <w:pPr>
+        <w:pStyle w:val="ListParagraph"/>
+        <w:numPr>
+          <w:ilvl w:val="1"/>
+          <w:numId w:val="2"/>
+        </w:numPr>
+        <w:spacing w:after="100"/>
+        <w:ind w:start="660"/>
+        <w:jc w:val="left"/>
+      </w:pPr>
+      <w:r>
+        <w:t xml:space="preserve">failed requests,</w:t>
+      </w:r>
+    </w:p>
+    <w:p>
+      <w:pPr>
+        <w:pStyle w:val="ListParagraph"/>
+        <w:numPr>
+          <w:ilvl w:val="1"/>
+          <w:numId w:val="2"/>
+        </w:numPr>
+        <w:spacing w:after="100"/>
+        <w:ind w:start="660"/>
+        <w:jc w:val="left"/>
+      </w:pPr>
+      <w:r>
+        <w:t xml:space="preserve">retries,</w:t>
+      </w:r>
+    </w:p>
+    <w:p>
+      <w:pPr>
+        <w:pStyle w:val="ListParagraph"/>
+        <w:numPr>
+          <w:ilvl w:val="1"/>
+          <w:numId w:val="2"/>
+        </w:numPr>
+        <w:spacing w:after="100"/>
+        <w:ind w:start="660"/>
+        <w:jc w:val="left"/>
+      </w:pPr>
+      <w:r>
+        <w:t xml:space="preserve">cache hits,</w:t>
+      </w:r>
+    </w:p>
+    <w:p>
+      <w:pPr>
+        <w:pStyle w:val="ListParagraph"/>
+        <w:numPr>
+          <w:ilvl w:val="1"/>
+          <w:numId w:val="2"/>
+        </w:numPr>
+        <w:spacing w:after="100"/>
+        <w:ind w:start="660"/>
+        <w:jc w:val="left"/>
+      </w:pPr>
+      <w:r>
+        <w:t xml:space="preserve">average processing time per assessment.</w:t>
+      </w:r>
+    </w:p>
+    <w:p>
+      <w:pPr>
+        <w:pStyle w:val="ListParagraph"/>
+        <w:numPr>
+          <w:ilvl w:val="0"/>
+          <w:numId w:val="2"/>
+        </w:numPr>
+        <w:spacing w:after="100"/>
+        <w:ind w:start="240"/>
+        <w:jc w:val="left"/>
+      </w:pPr>
+      <w:r>
+        <w:t xml:space="preserve">Add a maximum batch size guardrail for very large selections.</w:t>
+      </w:r>
+    </w:p>
+    <w:p>
+      <w:pPr>
+        <w:pStyle w:val="ListParagraph"/>
+        <w:numPr>
+          <w:ilvl w:val="0"/>
+          <w:numId w:val="2"/>
+        </w:numPr>
+        <w:spacing w:after="100"/>
+        <w:ind w:start="240"/>
+        <w:jc w:val="left"/>
+      </w:pPr>
+      <w:r>
+        <w:t xml:space="preserve">Consider queueing long-running jobs with pause/resume semantics.</w:t>
       </w:r>
     </w:p>
     <w:p>
@@ -8700,132 +8979,142 @@
         <w:jc w:val="left"/>
       </w:pPr>
       <w:r>
-        <w:t xml:space="preserve">Security Hardening</w:t>
-      </w:r>
-    </w:p>
-    <w:p>
-      <w:pPr>
-        <w:pStyle w:val="ListParagraph"/>
-        <w:numPr>
-          <w:ilvl w:val="0"/>
-          <w:numId w:val="2"/>
-        </w:numPr>
-        <w:spacing w:after="100"/>
-        <w:ind w:start="240"/>
-        <w:jc w:val="left"/>
-      </w:pPr>
-      <w:r>
-        <w:t xml:space="preserve">Review and approve all host permissions.</w:t>
-      </w:r>
-    </w:p>
-    <w:p>
-      <w:pPr>
-        <w:pStyle w:val="ListParagraph"/>
-        <w:numPr>
-          <w:ilvl w:val="0"/>
-          <w:numId w:val="2"/>
-        </w:numPr>
-        <w:spacing w:after="100"/>
-        <w:ind w:start="240"/>
-        <w:jc w:val="left"/>
-      </w:pPr>
-      <w:r>
-        <w:t xml:space="preserve">Keep host permissions limited to required Boeing domains.</w:t>
-      </w:r>
-    </w:p>
-    <w:p>
-      <w:pPr>
-        <w:pStyle w:val="ListParagraph"/>
-        <w:numPr>
-          <w:ilvl w:val="0"/>
-          <w:numId w:val="2"/>
-        </w:numPr>
-        <w:spacing w:after="100"/>
-        <w:ind w:start="240"/>
-        <w:jc w:val="left"/>
-      </w:pPr>
-      <w:r>
-        <w:t xml:space="preserve">Add content security policy review during release.</w:t>
-      </w:r>
-    </w:p>
-    <w:p>
-      <w:pPr>
-        <w:pStyle w:val="ListParagraph"/>
-        <w:numPr>
-          <w:ilvl w:val="0"/>
-          <w:numId w:val="2"/>
-        </w:numPr>
-        <w:spacing w:after="100"/>
-        <w:ind w:start="240"/>
-        <w:jc w:val="left"/>
-      </w:pPr>
-      <w:r>
-        <w:t xml:space="preserve">Avoid broad </w:t>
-      </w:r>
-      <w:r>
-        <w:rPr>
-          <w:rFonts w:ascii="Courier New" w:cs="Courier New" w:eastAsia="Courier New" w:hAnsi="Courier New"/>
-          <w:shd w:fill="F1F5F9" w:color="auto" w:val="clear"/>
-        </w:rPr>
-        <w:t xml:space="preserve">&lt;all_urls&gt;</w:t>
-      </w:r>
-      <w:r>
-        <w:t xml:space="preserve"> web-accessible resources unless explicitly justified.</w:t>
-      </w:r>
-    </w:p>
-    <w:p>
-      <w:pPr>
-        <w:pStyle w:val="ListParagraph"/>
-        <w:numPr>
-          <w:ilvl w:val="0"/>
-          <w:numId w:val="2"/>
-        </w:numPr>
-        <w:spacing w:after="100"/>
-        <w:ind w:start="240"/>
-        <w:jc w:val="left"/>
-      </w:pPr>
-      <w:r>
-        <w:t xml:space="preserve">Consider moving any sensitive endpoint configuration into a centrally managed configuration file.</w:t>
-      </w:r>
-    </w:p>
-    <w:p>
-      <w:pPr>
-        <w:pStyle w:val="ListParagraph"/>
-        <w:numPr>
-          <w:ilvl w:val="0"/>
-          <w:numId w:val="2"/>
-        </w:numPr>
-        <w:spacing w:after="100"/>
-        <w:ind w:start="240"/>
-        <w:jc w:val="left"/>
-      </w:pPr>
-      <w:r>
-        <w:t xml:space="preserve">Perform a security review of </w:t>
-      </w:r>
-      <w:r>
-        <w:rPr>
-          <w:rFonts w:ascii="Courier New" w:cs="Courier New" w:eastAsia="Courier New" w:hAnsi="Courier New"/>
-          <w:shd w:fill="F1F5F9" w:color="auto" w:val="clear"/>
-        </w:rPr>
-        <w:t xml:space="preserve">chrome.scripting</w:t>
-      </w:r>
-      <w:r>
-        <w:t xml:space="preserve"> usage because it executes code in trusted pages.</w:t>
-      </w:r>
-    </w:p>
-    <w:p>
-      <w:pPr>
-        <w:pStyle w:val="ListParagraph"/>
-        <w:numPr>
-          <w:ilvl w:val="0"/>
-          <w:numId w:val="2"/>
-        </w:numPr>
-        <w:spacing w:after="100"/>
-        <w:ind w:start="240"/>
-        <w:jc w:val="left"/>
-      </w:pPr>
-      <w:r>
-        <w:t xml:space="preserve">Add static analysis and dependency scanning to the build pipeline.</w:t>
+        <w:t xml:space="preserve">Observability</w:t>
+      </w:r>
+    </w:p>
+    <w:p>
+      <w:pPr>
+        <w:pStyle w:val="ListParagraph"/>
+        <w:numPr>
+          <w:ilvl w:val="0"/>
+          <w:numId w:val="2"/>
+        </w:numPr>
+        <w:spacing w:after="100"/>
+        <w:ind w:start="240"/>
+        <w:jc w:val="left"/>
+      </w:pPr>
+      <w:r>
+        <w:t xml:space="preserve">Add a diagnostics panel for:</w:t>
+      </w:r>
+    </w:p>
+    <w:p>
+      <w:pPr>
+        <w:pStyle w:val="ListParagraph"/>
+        <w:numPr>
+          <w:ilvl w:val="1"/>
+          <w:numId w:val="2"/>
+        </w:numPr>
+        <w:spacing w:after="100"/>
+        <w:ind w:start="660"/>
+        <w:jc w:val="left"/>
+      </w:pPr>
+      <w:r>
+        <w:t xml:space="preserve">current extension version,</w:t>
+      </w:r>
+    </w:p>
+    <w:p>
+      <w:pPr>
+        <w:pStyle w:val="ListParagraph"/>
+        <w:numPr>
+          <w:ilvl w:val="1"/>
+          <w:numId w:val="2"/>
+        </w:numPr>
+        <w:spacing w:after="100"/>
+        <w:ind w:start="660"/>
+        <w:jc w:val="left"/>
+      </w:pPr>
+      <w:r>
+        <w:t xml:space="preserve">last refresh time,</w:t>
+      </w:r>
+    </w:p>
+    <w:p>
+      <w:pPr>
+        <w:pStyle w:val="ListParagraph"/>
+        <w:numPr>
+          <w:ilvl w:val="1"/>
+          <w:numId w:val="2"/>
+        </w:numPr>
+        <w:spacing w:after="100"/>
+        <w:ind w:start="660"/>
+        <w:jc w:val="left"/>
+      </w:pPr>
+      <w:r>
+        <w:t xml:space="preserve">assessment count,</w:t>
+      </w:r>
+    </w:p>
+    <w:p>
+      <w:pPr>
+        <w:pStyle w:val="ListParagraph"/>
+        <w:numPr>
+          <w:ilvl w:val="1"/>
+          <w:numId w:val="2"/>
+        </w:numPr>
+        <w:spacing w:after="100"/>
+        <w:ind w:start="660"/>
+        <w:jc w:val="left"/>
+      </w:pPr>
+      <w:r>
+        <w:t xml:space="preserve">last validation/review run ID,</w:t>
+      </w:r>
+    </w:p>
+    <w:p>
+      <w:pPr>
+        <w:pStyle w:val="ListParagraph"/>
+        <w:numPr>
+          <w:ilvl w:val="1"/>
+          <w:numId w:val="2"/>
+        </w:numPr>
+        <w:spacing w:after="100"/>
+        <w:ind w:start="660"/>
+        <w:jc w:val="left"/>
+      </w:pPr>
+      <w:r>
+        <w:t xml:space="preserve">request statistics,</w:t>
+      </w:r>
+    </w:p>
+    <w:p>
+      <w:pPr>
+        <w:pStyle w:val="ListParagraph"/>
+        <w:numPr>
+          <w:ilvl w:val="1"/>
+          <w:numId w:val="2"/>
+        </w:numPr>
+        <w:spacing w:after="100"/>
+        <w:ind w:start="660"/>
+        <w:jc w:val="left"/>
+      </w:pPr>
+      <w:r>
+        <w:t xml:space="preserve">failed endpoint summary.</w:t>
+      </w:r>
+    </w:p>
+    <w:p>
+      <w:pPr>
+        <w:pStyle w:val="ListParagraph"/>
+        <w:numPr>
+          <w:ilvl w:val="0"/>
+          <w:numId w:val="2"/>
+        </w:numPr>
+        <w:spacing w:after="100"/>
+        <w:ind w:start="240"/>
+        <w:jc w:val="left"/>
+      </w:pPr>
+      <w:r>
+        <w:t xml:space="preserve">Add exportable diagnostic logs that do not include sensitive tokens.</w:t>
+      </w:r>
+    </w:p>
+    <w:p>
+      <w:pPr>
+        <w:pStyle w:val="ListParagraph"/>
+        <w:numPr>
+          <w:ilvl w:val="0"/>
+          <w:numId w:val="2"/>
+        </w:numPr>
+        <w:spacing w:after="100"/>
+        <w:ind w:start="240"/>
+        <w:jc w:val="left"/>
+      </w:pPr>
+      <w:r>
+        <w:t xml:space="preserve">Add user-friendly error messages mapped to common authentication/session failures.</w:t>
       </w:r>
     </w:p>
     <w:p>
@@ -8843,67 +9132,115 @@
         <w:jc w:val="left"/>
       </w:pPr>
       <w:r>
-        <w:t xml:space="preserve">Performance and Scale</w:t>
-      </w:r>
-    </w:p>
-    <w:p>
-      <w:pPr>
-        <w:pStyle w:val="ListParagraph"/>
-        <w:numPr>
-          <w:ilvl w:val="0"/>
-          <w:numId w:val="2"/>
-        </w:numPr>
-        <w:spacing w:after="100"/>
-        <w:ind w:start="240"/>
-        <w:jc w:val="left"/>
-      </w:pPr>
-      <w:r>
-        <w:t xml:space="preserve">Keep validation concurrency configurable.</w:t>
-      </w:r>
-    </w:p>
-    <w:p>
-      <w:pPr>
-        <w:pStyle w:val="ListParagraph"/>
-        <w:numPr>
-          <w:ilvl w:val="0"/>
-          <w:numId w:val="2"/>
-        </w:numPr>
-        <w:spacing w:after="100"/>
-        <w:ind w:start="240"/>
-        <w:jc w:val="left"/>
-      </w:pPr>
-      <w:r>
-        <w:t xml:space="preserve">Keep review concurrency configurable.</w:t>
-      </w:r>
-    </w:p>
-    <w:p>
-      <w:pPr>
-        <w:pStyle w:val="ListParagraph"/>
-        <w:numPr>
-          <w:ilvl w:val="0"/>
-          <w:numId w:val="2"/>
-        </w:numPr>
-        <w:spacing w:after="100"/>
-        <w:ind w:start="240"/>
-        <w:jc w:val="left"/>
-      </w:pPr>
-      <w:r>
-        <w:t xml:space="preserve">Add API rate-limit backoff if upstream systems require it.</w:t>
-      </w:r>
-    </w:p>
-    <w:p>
-      <w:pPr>
-        <w:pStyle w:val="ListParagraph"/>
-        <w:numPr>
-          <w:ilvl w:val="0"/>
-          <w:numId w:val="2"/>
-        </w:numPr>
-        <w:spacing w:after="100"/>
-        <w:ind w:start="240"/>
-        <w:jc w:val="left"/>
-      </w:pPr>
-      <w:r>
-        <w:t xml:space="preserve">Add request telemetry counters for:</w:t>
+        <w:t xml:space="preserve">Data Handling</w:t>
+      </w:r>
+    </w:p>
+    <w:p>
+      <w:pPr>
+        <w:pStyle w:val="ListParagraph"/>
+        <w:numPr>
+          <w:ilvl w:val="0"/>
+          <w:numId w:val="2"/>
+        </w:numPr>
+        <w:spacing w:after="100"/>
+        <w:ind w:start="240"/>
+        <w:jc w:val="left"/>
+      </w:pPr>
+      <w:r>
+        <w:t xml:space="preserve">Define retention policy for local validation/review results.</w:t>
+      </w:r>
+    </w:p>
+    <w:p>
+      <w:pPr>
+        <w:pStyle w:val="ListParagraph"/>
+        <w:numPr>
+          <w:ilvl w:val="0"/>
+          <w:numId w:val="2"/>
+        </w:numPr>
+        <w:spacing w:after="100"/>
+        <w:ind w:start="240"/>
+        <w:jc w:val="left"/>
+      </w:pPr>
+      <w:r>
+        <w:t xml:space="preserve">Add a "clear all local data" administrative option.</w:t>
+      </w:r>
+    </w:p>
+    <w:p>
+      <w:pPr>
+        <w:pStyle w:val="ListParagraph"/>
+        <w:numPr>
+          <w:ilvl w:val="0"/>
+          <w:numId w:val="2"/>
+        </w:numPr>
+        <w:spacing w:after="100"/>
+        <w:ind w:start="240"/>
+        <w:jc w:val="left"/>
+      </w:pPr>
+      <w:r>
+        <w:t xml:space="preserve">Consider encrypting sensitive locally stored context if policy requires it.</w:t>
+      </w:r>
+    </w:p>
+    <w:p>
+      <w:pPr>
+        <w:pStyle w:val="ListParagraph"/>
+        <w:numPr>
+          <w:ilvl w:val="0"/>
+          <w:numId w:val="2"/>
+        </w:numPr>
+        <w:spacing w:after="100"/>
+        <w:ind w:start="240"/>
+        <w:jc w:val="left"/>
+      </w:pPr>
+      <w:r>
+        <w:t xml:space="preserve">Avoid storing unnecessary raw API payloads long term.</w:t>
+      </w:r>
+    </w:p>
+    <w:p>
+      <w:pPr>
+        <w:pStyle w:val="ListParagraph"/>
+        <w:numPr>
+          <w:ilvl w:val="0"/>
+          <w:numId w:val="2"/>
+        </w:numPr>
+        <w:spacing w:after="100"/>
+        <w:ind w:start="240"/>
+        <w:jc w:val="left"/>
+      </w:pPr>
+      <w:r>
+        <w:t xml:space="preserve">Review generated Excel and Word artifacts for classification/handling requirements.</w:t>
+      </w:r>
+    </w:p>
+    <w:p>
+      <w:pPr>
+        <w:spacing w:after="200"/>
+      </w:pPr>
+      <w:r>
+        <w:t xml:space="preserve"> </w:t>
+      </w:r>
+    </w:p>
+    <w:p>
+      <w:pPr>
+        <w:pStyle w:val="Heading3"/>
+        <w:spacing w:after="200"/>
+        <w:jc w:val="left"/>
+      </w:pPr>
+      <w:r>
+        <w:t xml:space="preserve">Reliability</w:t>
+      </w:r>
+    </w:p>
+    <w:p>
+      <w:pPr>
+        <w:pStyle w:val="ListParagraph"/>
+        <w:numPr>
+          <w:ilvl w:val="0"/>
+          <w:numId w:val="2"/>
+        </w:numPr>
+        <w:spacing w:after="100"/>
+        <w:ind w:start="240"/>
+        <w:jc w:val="left"/>
+      </w:pPr>
+      <w:r>
+        <w:t xml:space="preserve">Add automated unit tests for:</w:t>
       </w:r>
     </w:p>
     <w:p>
@@ -8918,7 +9255,7 @@
         <w:jc w:val="left"/>
       </w:pPr>
       <w:r>
-        <w:t xml:space="preserve">successful requests,</w:t>
+        <w:t xml:space="preserve">assessment filtering,</w:t>
       </w:r>
     </w:p>
     <w:p>
@@ -8933,7 +9270,7 @@
         <w:jc w:val="left"/>
       </w:pPr>
       <w:r>
-        <w:t xml:space="preserve">failed requests,</w:t>
+        <w:t xml:space="preserve">review traversal,</w:t>
       </w:r>
     </w:p>
     <w:p>
@@ -8948,7 +9285,7 @@
         <w:jc w:val="left"/>
       </w:pPr>
       <w:r>
-        <w:t xml:space="preserve">retries,</w:t>
+        <w:t xml:space="preserve">answer normalization,</w:t>
       </w:r>
     </w:p>
     <w:p>
@@ -8963,7 +9300,7 @@
         <w:jc w:val="left"/>
       </w:pPr>
       <w:r>
-        <w:t xml:space="preserve">cache hits,</w:t>
+        <w:t xml:space="preserve">template version selection,</w:t>
       </w:r>
     </w:p>
     <w:p>
@@ -8978,70 +9315,7 @@
         <w:jc w:val="left"/>
       </w:pPr>
       <w:r>
-        <w:t xml:space="preserve">average processing time per assessment.</w:t>
-      </w:r>
-    </w:p>
-    <w:p>
-      <w:pPr>
-        <w:pStyle w:val="ListParagraph"/>
-        <w:numPr>
-          <w:ilvl w:val="0"/>
-          <w:numId w:val="2"/>
-        </w:numPr>
-        <w:spacing w:after="100"/>
-        <w:ind w:start="240"/>
-        <w:jc w:val="left"/>
-      </w:pPr>
-      <w:r>
-        <w:t xml:space="preserve">Add a maximum batch size guardrail for very large selections.</w:t>
-      </w:r>
-    </w:p>
-    <w:p>
-      <w:pPr>
-        <w:pStyle w:val="ListParagraph"/>
-        <w:numPr>
-          <w:ilvl w:val="0"/>
-          <w:numId w:val="2"/>
-        </w:numPr>
-        <w:spacing w:after="100"/>
-        <w:ind w:start="240"/>
-        <w:jc w:val="left"/>
-      </w:pPr>
-      <w:r>
-        <w:t xml:space="preserve">Consider queueing long-running jobs with pause/resume semantics.</w:t>
-      </w:r>
-    </w:p>
-    <w:p>
-      <w:pPr>
-        <w:spacing w:after="200"/>
-      </w:pPr>
-      <w:r>
-        <w:t xml:space="preserve"> </w:t>
-      </w:r>
-    </w:p>
-    <w:p>
-      <w:pPr>
-        <w:pStyle w:val="Heading3"/>
-        <w:spacing w:after="200"/>
-        <w:jc w:val="left"/>
-      </w:pPr>
-      <w:r>
-        <w:t xml:space="preserve">Observability</w:t>
-      </w:r>
-    </w:p>
-    <w:p>
-      <w:pPr>
-        <w:pStyle w:val="ListParagraph"/>
-        <w:numPr>
-          <w:ilvl w:val="0"/>
-          <w:numId w:val="2"/>
-        </w:numPr>
-        <w:spacing w:after="100"/>
-        <w:ind w:start="240"/>
-        <w:jc w:val="left"/>
-      </w:pPr>
-      <w:r>
-        <w:t xml:space="preserve">Add a diagnostics panel for:</w:t>
+        <w:t xml:space="preserve">DOCX XML generation,</w:t>
       </w:r>
     </w:p>
     <w:p>
@@ -9056,327 +9330,6 @@
         <w:jc w:val="left"/>
       </w:pPr>
       <w:r>
-        <w:t xml:space="preserve">current extension version,</w:t>
-      </w:r>
-    </w:p>
-    <w:p>
-      <w:pPr>
-        <w:pStyle w:val="ListParagraph"/>
-        <w:numPr>
-          <w:ilvl w:val="1"/>
-          <w:numId w:val="2"/>
-        </w:numPr>
-        <w:spacing w:after="100"/>
-        <w:ind w:start="660"/>
-        <w:jc w:val="left"/>
-      </w:pPr>
-      <w:r>
-        <w:t xml:space="preserve">last refresh time,</w:t>
-      </w:r>
-    </w:p>
-    <w:p>
-      <w:pPr>
-        <w:pStyle w:val="ListParagraph"/>
-        <w:numPr>
-          <w:ilvl w:val="1"/>
-          <w:numId w:val="2"/>
-        </w:numPr>
-        <w:spacing w:after="100"/>
-        <w:ind w:start="660"/>
-        <w:jc w:val="left"/>
-      </w:pPr>
-      <w:r>
-        <w:t xml:space="preserve">assessment count,</w:t>
-      </w:r>
-    </w:p>
-    <w:p>
-      <w:pPr>
-        <w:pStyle w:val="ListParagraph"/>
-        <w:numPr>
-          <w:ilvl w:val="1"/>
-          <w:numId w:val="2"/>
-        </w:numPr>
-        <w:spacing w:after="100"/>
-        <w:ind w:start="660"/>
-        <w:jc w:val="left"/>
-      </w:pPr>
-      <w:r>
-        <w:t xml:space="preserve">last validation/review run ID,</w:t>
-      </w:r>
-    </w:p>
-    <w:p>
-      <w:pPr>
-        <w:pStyle w:val="ListParagraph"/>
-        <w:numPr>
-          <w:ilvl w:val="1"/>
-          <w:numId w:val="2"/>
-        </w:numPr>
-        <w:spacing w:after="100"/>
-        <w:ind w:start="660"/>
-        <w:jc w:val="left"/>
-      </w:pPr>
-      <w:r>
-        <w:t xml:space="preserve">request statistics,</w:t>
-      </w:r>
-    </w:p>
-    <w:p>
-      <w:pPr>
-        <w:pStyle w:val="ListParagraph"/>
-        <w:numPr>
-          <w:ilvl w:val="1"/>
-          <w:numId w:val="2"/>
-        </w:numPr>
-        <w:spacing w:after="100"/>
-        <w:ind w:start="660"/>
-        <w:jc w:val="left"/>
-      </w:pPr>
-      <w:r>
-        <w:t xml:space="preserve">failed endpoint summary.</w:t>
-      </w:r>
-    </w:p>
-    <w:p>
-      <w:pPr>
-        <w:pStyle w:val="ListParagraph"/>
-        <w:numPr>
-          <w:ilvl w:val="0"/>
-          <w:numId w:val="2"/>
-        </w:numPr>
-        <w:spacing w:after="100"/>
-        <w:ind w:start="240"/>
-        <w:jc w:val="left"/>
-      </w:pPr>
-      <w:r>
-        <w:t xml:space="preserve">Add exportable diagnostic logs that do not include sensitive tokens.</w:t>
-      </w:r>
-    </w:p>
-    <w:p>
-      <w:pPr>
-        <w:pStyle w:val="ListParagraph"/>
-        <w:numPr>
-          <w:ilvl w:val="0"/>
-          <w:numId w:val="2"/>
-        </w:numPr>
-        <w:spacing w:after="100"/>
-        <w:ind w:start="240"/>
-        <w:jc w:val="left"/>
-      </w:pPr>
-      <w:r>
-        <w:t xml:space="preserve">Add user-friendly error messages mapped to common authentication/session failures.</w:t>
-      </w:r>
-    </w:p>
-    <w:p>
-      <w:pPr>
-        <w:spacing w:after="200"/>
-      </w:pPr>
-      <w:r>
-        <w:t xml:space="preserve"> </w:t>
-      </w:r>
-    </w:p>
-    <w:p>
-      <w:pPr>
-        <w:pStyle w:val="Heading3"/>
-        <w:spacing w:after="200"/>
-        <w:jc w:val="left"/>
-      </w:pPr>
-      <w:r>
-        <w:t xml:space="preserve">Data Handling</w:t>
-      </w:r>
-    </w:p>
-    <w:p>
-      <w:pPr>
-        <w:pStyle w:val="ListParagraph"/>
-        <w:numPr>
-          <w:ilvl w:val="0"/>
-          <w:numId w:val="2"/>
-        </w:numPr>
-        <w:spacing w:after="100"/>
-        <w:ind w:start="240"/>
-        <w:jc w:val="left"/>
-      </w:pPr>
-      <w:r>
-        <w:t xml:space="preserve">Define retention policy for local validation/review results.</w:t>
-      </w:r>
-    </w:p>
-    <w:p>
-      <w:pPr>
-        <w:pStyle w:val="ListParagraph"/>
-        <w:numPr>
-          <w:ilvl w:val="0"/>
-          <w:numId w:val="2"/>
-        </w:numPr>
-        <w:spacing w:after="100"/>
-        <w:ind w:start="240"/>
-        <w:jc w:val="left"/>
-      </w:pPr>
-      <w:r>
-        <w:t xml:space="preserve">Add a "clear all local data" administrative option.</w:t>
-      </w:r>
-    </w:p>
-    <w:p>
-      <w:pPr>
-        <w:pStyle w:val="ListParagraph"/>
-        <w:numPr>
-          <w:ilvl w:val="0"/>
-          <w:numId w:val="2"/>
-        </w:numPr>
-        <w:spacing w:after="100"/>
-        <w:ind w:start="240"/>
-        <w:jc w:val="left"/>
-      </w:pPr>
-      <w:r>
-        <w:t xml:space="preserve">Consider encrypting sensitive locally stored context if policy requires it.</w:t>
-      </w:r>
-    </w:p>
-    <w:p>
-      <w:pPr>
-        <w:pStyle w:val="ListParagraph"/>
-        <w:numPr>
-          <w:ilvl w:val="0"/>
-          <w:numId w:val="2"/>
-        </w:numPr>
-        <w:spacing w:after="100"/>
-        <w:ind w:start="240"/>
-        <w:jc w:val="left"/>
-      </w:pPr>
-      <w:r>
-        <w:t xml:space="preserve">Avoid storing unnecessary raw API payloads long term.</w:t>
-      </w:r>
-    </w:p>
-    <w:p>
-      <w:pPr>
-        <w:pStyle w:val="ListParagraph"/>
-        <w:numPr>
-          <w:ilvl w:val="0"/>
-          <w:numId w:val="2"/>
-        </w:numPr>
-        <w:spacing w:after="100"/>
-        <w:ind w:start="240"/>
-        <w:jc w:val="left"/>
-      </w:pPr>
-      <w:r>
-        <w:t xml:space="preserve">Review generated Excel and Word artifacts for classification/handling requirements.</w:t>
-      </w:r>
-    </w:p>
-    <w:p>
-      <w:pPr>
-        <w:spacing w:after="200"/>
-      </w:pPr>
-      <w:r>
-        <w:t xml:space="preserve"> </w:t>
-      </w:r>
-    </w:p>
-    <w:p>
-      <w:pPr>
-        <w:pStyle w:val="Heading3"/>
-        <w:spacing w:after="200"/>
-        <w:jc w:val="left"/>
-      </w:pPr>
-      <w:r>
-        <w:t xml:space="preserve">Reliability</w:t>
-      </w:r>
-    </w:p>
-    <w:p>
-      <w:pPr>
-        <w:pStyle w:val="ListParagraph"/>
-        <w:numPr>
-          <w:ilvl w:val="0"/>
-          <w:numId w:val="2"/>
-        </w:numPr>
-        <w:spacing w:after="100"/>
-        <w:ind w:start="240"/>
-        <w:jc w:val="left"/>
-      </w:pPr>
-      <w:r>
-        <w:t xml:space="preserve">Add automated unit tests for:</w:t>
-      </w:r>
-    </w:p>
-    <w:p>
-      <w:pPr>
-        <w:pStyle w:val="ListParagraph"/>
-        <w:numPr>
-          <w:ilvl w:val="1"/>
-          <w:numId w:val="2"/>
-        </w:numPr>
-        <w:spacing w:after="100"/>
-        <w:ind w:start="660"/>
-        <w:jc w:val="left"/>
-      </w:pPr>
-      <w:r>
-        <w:t xml:space="preserve">assessment filtering,</w:t>
-      </w:r>
-    </w:p>
-    <w:p>
-      <w:pPr>
-        <w:pStyle w:val="ListParagraph"/>
-        <w:numPr>
-          <w:ilvl w:val="1"/>
-          <w:numId w:val="2"/>
-        </w:numPr>
-        <w:spacing w:after="100"/>
-        <w:ind w:start="660"/>
-        <w:jc w:val="left"/>
-      </w:pPr>
-      <w:r>
-        <w:t xml:space="preserve">review traversal,</w:t>
-      </w:r>
-    </w:p>
-    <w:p>
-      <w:pPr>
-        <w:pStyle w:val="ListParagraph"/>
-        <w:numPr>
-          <w:ilvl w:val="1"/>
-          <w:numId w:val="2"/>
-        </w:numPr>
-        <w:spacing w:after="100"/>
-        <w:ind w:start="660"/>
-        <w:jc w:val="left"/>
-      </w:pPr>
-      <w:r>
-        <w:t xml:space="preserve">answer normalization,</w:t>
-      </w:r>
-    </w:p>
-    <w:p>
-      <w:pPr>
-        <w:pStyle w:val="ListParagraph"/>
-        <w:numPr>
-          <w:ilvl w:val="1"/>
-          <w:numId w:val="2"/>
-        </w:numPr>
-        <w:spacing w:after="100"/>
-        <w:ind w:start="660"/>
-        <w:jc w:val="left"/>
-      </w:pPr>
-      <w:r>
-        <w:t xml:space="preserve">template version selection,</w:t>
-      </w:r>
-    </w:p>
-    <w:p>
-      <w:pPr>
-        <w:pStyle w:val="ListParagraph"/>
-        <w:numPr>
-          <w:ilvl w:val="1"/>
-          <w:numId w:val="2"/>
-        </w:numPr>
-        <w:spacing w:after="100"/>
-        <w:ind w:start="660"/>
-        <w:jc w:val="left"/>
-      </w:pPr>
-      <w:r>
-        <w:t xml:space="preserve">DOCX XML generation,</w:t>
-      </w:r>
-    </w:p>
-    <w:p>
-      <w:pPr>
-        <w:pStyle w:val="ListParagraph"/>
-        <w:numPr>
-          <w:ilvl w:val="1"/>
-          <w:numId w:val="2"/>
-        </w:numPr>
-        <w:spacing w:after="100"/>
-        <w:ind w:start="660"/>
-        <w:jc w:val="left"/>
-      </w:pPr>
-      <w:r>
         <w:t xml:space="preserve">checkpoint scoring.</w:t>
       </w:r>
     </w:p>
@@ -9422,7 +9375,7 @@
         <w:jc w:val="left"/>
       </w:pPr>
       <w:r>
-        <w:t xml:space="preserve">Add a build validation step that loads the extension package in a headless browser.</w:t>
+        <w:t xml:space="preserve">Add a build validation step that loads the extension package in Microsoft Edge automation.</w:t>
       </w:r>
     </w:p>
     <w:p>
@@ -9945,7 +9898,7 @@
         <w:jc w:val="left"/>
       </w:pPr>
       <w:r>
-        <w:t xml:space="preserve">Load in Chrome:</w:t>
+        <w:t xml:space="preserve">Load in Microsoft Edge:</w:t>
       </w:r>
     </w:p>
     <w:p>
@@ -9973,7 +9926,7 @@
           <w:rFonts w:ascii="Courier New" w:cs="Courier New" w:eastAsia="Courier New" w:hAnsi="Courier New"/>
           <w:shd w:fill="F1F5F9" w:color="auto" w:val="clear"/>
         </w:rPr>
-        <w:t xml:space="preserve">chrome://extensions</w:t>
+        <w:t xml:space="preserve">edge://extensions</w:t>
       </w:r>
       <w:r>
         <w:t xml:space="preserve">.</w:t>
@@ -10107,7 +10060,7 @@
           <w:sz w:val="20"/>
           <w:szCs w:val="20"/>
         </w:rPr>
-        <w:t xml:space="preserve">    Manifest: Chrome Extension Manifest V3    </w:t>
+        <w:t xml:space="preserve">    Manifest: Microsoft Edge Manifest V3    </w:t>
       </w:r>
       <w:r>
         <w:br/>

</xml_diff>